<commit_message>
docs: add current home.lab Supervisor Services capture (Kubernetes Service Active) to walkthrough
Co-Authored-By: Claude Opus 4.8 <noreply@anthropic.com>
</commit_message>
<xml_diff>
--- a/VKS-Supervisor-VNA-VPC-walkthrough.docx
+++ b/VKS-Supervisor-VNA-VPC-walkthrough.docx
@@ -209,6 +209,81 @@
           <w:sz w:val="19"/>
           <w:szCs w:val="19"/>
         </w:rPr>
+        <w:t xml:space="preserve">▸ cur-04-supervisor-services.png  </w:t>
+      </w:r>
+      <w:r>
+        <w:rPr>
+          <w:color w:val="333333"/>
+          <w:sz w:val="19"/>
+          <w:szCs w:val="19"/>
+        </w:rPr>
+        <w:t xml:space="preserve">Supervisor Management → Services。已註冊的 Supervisor Services:VM Service、**Kubernetes Service = Active(Core Service、Supervisors 1)**(VKS guest cluster 佈建能力就緒)、Velero vSphere Operator、Local Consumption Interface。登入 Administrator@VSPHERE.LOCAL(Local Account)。</w:t>
+      </w:r>
+    </w:p>
+    <w:p>
+      <w:pPr>
+        <w:pBdr>
+          <w:top w:val="single" w:color="CCCCCC" w:sz="4"/>
+          <w:bottom w:val="single" w:color="CCCCCC" w:sz="4"/>
+          <w:left w:val="single" w:color="CCCCCC" w:sz="4"/>
+          <w:right w:val="single" w:color="CCCCCC" w:sz="4"/>
+        </w:pBdr>
+        <w:spacing w:after="80"/>
+        <w:jc w:val="center"/>
+      </w:pPr>
+      <w:r>
+        <w:drawing>
+          <wp:inline distT="0" distB="0" distL="0" distR="0">
+            <wp:extent cx="5715000" cy="3448050"/>
+            <wp:effectExtent t="0" r="0" b="0" l="0"/>
+            <wp:docPr id="1" name="" descr="" title=""/>
+            <wp:cNvGraphicFramePr>
+              <a:graphicFrameLocks xmlns:a="http://schemas.openxmlformats.org/drawingml/2006/main" noChangeAspect="1"/>
+            </wp:cNvGraphicFramePr>
+            <a:graphic xmlns:a="http://schemas.openxmlformats.org/drawingml/2006/main">
+              <a:graphicData uri="http://schemas.openxmlformats.org/drawingml/2006/picture">
+                <pic:pic xmlns:pic="http://schemas.openxmlformats.org/drawingml/2006/picture">
+                  <pic:nvPicPr>
+                    <pic:cNvPr id="0" name="" descr=""/>
+                    <pic:cNvPicPr>
+                      <a:picLocks noChangeAspect="1" noChangeArrowheads="1"/>
+                    </pic:cNvPicPr>
+                  </pic:nvPicPr>
+                  <pic:blipFill>
+                    <a:blip r:embed="rId9" cstate="none"/>
+                    <a:srcRect/>
+                    <a:stretch>
+                      <a:fillRect/>
+                    </a:stretch>
+                  </pic:blipFill>
+                  <pic:spPr bwMode="auto">
+                    <a:xfrm>
+                      <a:off x="0" y="0"/>
+                      <a:ext cx="5715000" cy="3448050"/>
+                    </a:xfrm>
+                    <a:prstGeom prst="rect">
+                      <a:avLst/>
+                    </a:prstGeom>
+                  </pic:spPr>
+                </pic:pic>
+              </a:graphicData>
+            </a:graphic>
+          </wp:inline>
+        </w:drawing>
+      </w:r>
+    </w:p>
+    <w:p>
+      <w:pPr>
+        <w:spacing w:after="40" w:before="160"/>
+      </w:pPr>
+      <w:r>
+        <w:rPr>
+          <w:b/>
+          <w:bCs/>
+          <w:color w:val="2E5A9C"/>
+          <w:sz w:val="19"/>
+          <w:szCs w:val="19"/>
+        </w:rPr>
         <w:t xml:space="preserve">▸ cur-01-depot-service-health.png  </w:t>
       </w:r>
       <w:r>
@@ -250,7 +325,7 @@
                     </pic:cNvPicPr>
                   </pic:nvPicPr>
                   <pic:blipFill>
-                    <a:blip r:embed="rId9" cstate="none"/>
+                    <a:blip r:embed="rId10" cstate="none"/>
                     <a:srcRect/>
                     <a:stretch>
                       <a:fillRect/>
@@ -334,7 +409,7 @@
                     </pic:cNvPicPr>
                   </pic:nvPicPr>
                   <pic:blipFill>
-                    <a:blip r:embed="rId10" cstate="none"/>
+                    <a:blip r:embed="rId11" cstate="none"/>
                     <a:srcRect/>
                     <a:stretch>
                       <a:fillRect/>
@@ -418,7 +493,7 @@
                     </pic:cNvPicPr>
                   </pic:nvPicPr>
                   <pic:blipFill>
-                    <a:blip r:embed="rId11" cstate="none"/>
+                    <a:blip r:embed="rId12" cstate="none"/>
                     <a:srcRect/>
                     <a:stretch>
                       <a:fillRect/>
@@ -493,7 +568,7 @@
                     </pic:cNvPicPr>
                   </pic:nvPicPr>
                   <pic:blipFill>
-                    <a:blip r:embed="rId12" cstate="none"/>
+                    <a:blip r:embed="rId13" cstate="none"/>
                     <a:srcRect/>
                     <a:stretch>
                       <a:fillRect/>
@@ -568,7 +643,7 @@
                     </pic:cNvPicPr>
                   </pic:nvPicPr>
                   <pic:blipFill>
-                    <a:blip r:embed="rId13" cstate="none"/>
+                    <a:blip r:embed="rId14" cstate="none"/>
                     <a:srcRect/>
                     <a:stretch>
                       <a:fillRect/>
@@ -643,7 +718,7 @@
                     </pic:cNvPicPr>
                   </pic:nvPicPr>
                   <pic:blipFill>
-                    <a:blip r:embed="rId14" cstate="none"/>
+                    <a:blip r:embed="rId15" cstate="none"/>
                     <a:srcRect/>
                     <a:stretch>
                       <a:fillRect/>
@@ -718,7 +793,7 @@
                     </pic:cNvPicPr>
                   </pic:nvPicPr>
                   <pic:blipFill>
-                    <a:blip r:embed="rId15" cstate="none"/>
+                    <a:blip r:embed="rId16" cstate="none"/>
                     <a:srcRect/>
                     <a:stretch>
                       <a:fillRect/>
@@ -793,7 +868,7 @@
                     </pic:cNvPicPr>
                   </pic:nvPicPr>
                   <pic:blipFill>
-                    <a:blip r:embed="rId16" cstate="none"/>
+                    <a:blip r:embed="rId17" cstate="none"/>
                     <a:srcRect/>
                     <a:stretch>
                       <a:fillRect/>
@@ -868,7 +943,7 @@
                     </pic:cNvPicPr>
                   </pic:nvPicPr>
                   <pic:blipFill>
-                    <a:blip r:embed="rId17" cstate="none"/>
+                    <a:blip r:embed="rId18" cstate="none"/>
                     <a:srcRect/>
                     <a:stretch>
                       <a:fillRect/>
@@ -952,7 +1027,7 @@
                     </pic:cNvPicPr>
                   </pic:nvPicPr>
                   <pic:blipFill>
-                    <a:blip r:embed="rId18" cstate="none"/>
+                    <a:blip r:embed="rId19" cstate="none"/>
                     <a:srcRect/>
                     <a:stretch>
                       <a:fillRect/>
@@ -1027,7 +1102,7 @@
                     </pic:cNvPicPr>
                   </pic:nvPicPr>
                   <pic:blipFill>
-                    <a:blip r:embed="rId19" cstate="none"/>
+                    <a:blip r:embed="rId20" cstate="none"/>
                     <a:srcRect/>
                     <a:stretch>
                       <a:fillRect/>
@@ -1111,7 +1186,7 @@
                     </pic:cNvPicPr>
                   </pic:nvPicPr>
                   <pic:blipFill>
-                    <a:blip r:embed="rId20" cstate="none"/>
+                    <a:blip r:embed="rId21" cstate="none"/>
                     <a:srcRect/>
                     <a:stretch>
                       <a:fillRect/>
@@ -1186,7 +1261,7 @@
                     </pic:cNvPicPr>
                   </pic:nvPicPr>
                   <pic:blipFill>
-                    <a:blip r:embed="rId21" cstate="none"/>
+                    <a:blip r:embed="rId22" cstate="none"/>
                     <a:srcRect/>
                     <a:stretch>
                       <a:fillRect/>
@@ -1261,7 +1336,7 @@
                     </pic:cNvPicPr>
                   </pic:nvPicPr>
                   <pic:blipFill>
-                    <a:blip r:embed="rId22" cstate="none"/>
+                    <a:blip r:embed="rId23" cstate="none"/>
                     <a:srcRect/>
                     <a:stretch>
                       <a:fillRect/>
@@ -1336,7 +1411,7 @@
                     </pic:cNvPicPr>
                   </pic:nvPicPr>
                   <pic:blipFill>
-                    <a:blip r:embed="rId23" cstate="none"/>
+                    <a:blip r:embed="rId24" cstate="none"/>
                     <a:srcRect/>
                     <a:stretch>
                       <a:fillRect/>
@@ -1411,7 +1486,7 @@
                     </pic:cNvPicPr>
                   </pic:nvPicPr>
                   <pic:blipFill>
-                    <a:blip r:embed="rId24" cstate="none"/>
+                    <a:blip r:embed="rId25" cstate="none"/>
                     <a:srcRect/>
                     <a:stretch>
                       <a:fillRect/>
@@ -1486,7 +1561,7 @@
                     </pic:cNvPicPr>
                   </pic:nvPicPr>
                   <pic:blipFill>
-                    <a:blip r:embed="rId25" cstate="none"/>
+                    <a:blip r:embed="rId26" cstate="none"/>
                     <a:srcRect/>
                     <a:stretch>
                       <a:fillRect/>
@@ -1561,7 +1636,7 @@
                     </pic:cNvPicPr>
                   </pic:nvPicPr>
                   <pic:blipFill>
-                    <a:blip r:embed="rId26" cstate="none"/>
+                    <a:blip r:embed="rId27" cstate="none"/>
                     <a:srcRect/>
                     <a:stretch>
                       <a:fillRect/>
@@ -1636,7 +1711,7 @@
                     </pic:cNvPicPr>
                   </pic:nvPicPr>
                   <pic:blipFill>
-                    <a:blip r:embed="rId27" cstate="none"/>
+                    <a:blip r:embed="rId28" cstate="none"/>
                     <a:srcRect/>
                     <a:stretch>
                       <a:fillRect/>
@@ -1711,7 +1786,7 @@
                     </pic:cNvPicPr>
                   </pic:nvPicPr>
                   <pic:blipFill>
-                    <a:blip r:embed="rId28" cstate="none"/>
+                    <a:blip r:embed="rId29" cstate="none"/>
                     <a:srcRect/>
                     <a:stretch>
                       <a:fillRect/>
@@ -1795,7 +1870,7 @@
                     </pic:cNvPicPr>
                   </pic:nvPicPr>
                   <pic:blipFill>
-                    <a:blip r:embed="rId29" cstate="none"/>
+                    <a:blip r:embed="rId30" cstate="none"/>
                     <a:srcRect/>
                     <a:stretch>
                       <a:fillRect/>
@@ -1870,7 +1945,7 @@
                     </pic:cNvPicPr>
                   </pic:nvPicPr>
                   <pic:blipFill>
-                    <a:blip r:embed="rId30" cstate="none"/>
+                    <a:blip r:embed="rId31" cstate="none"/>
                     <a:srcRect/>
                     <a:stretch>
                       <a:fillRect/>
@@ -1945,7 +2020,7 @@
                     </pic:cNvPicPr>
                   </pic:nvPicPr>
                   <pic:blipFill>
-                    <a:blip r:embed="rId31" cstate="none"/>
+                    <a:blip r:embed="rId32" cstate="none"/>
                     <a:srcRect/>
                     <a:stretch>
                       <a:fillRect/>
@@ -2020,7 +2095,7 @@
                     </pic:cNvPicPr>
                   </pic:nvPicPr>
                   <pic:blipFill>
-                    <a:blip r:embed="rId32" cstate="none"/>
+                    <a:blip r:embed="rId33" cstate="none"/>
                     <a:srcRect/>
                     <a:stretch>
                       <a:fillRect/>
@@ -2104,7 +2179,7 @@
                     </pic:cNvPicPr>
                   </pic:nvPicPr>
                   <pic:blipFill>
-                    <a:blip r:embed="rId33" cstate="none"/>
+                    <a:blip r:embed="rId34" cstate="none"/>
                     <a:srcRect/>
                     <a:stretch>
                       <a:fillRect/>
@@ -2179,7 +2254,7 @@
                     </pic:cNvPicPr>
                   </pic:nvPicPr>
                   <pic:blipFill>
-                    <a:blip r:embed="rId34" cstate="none"/>
+                    <a:blip r:embed="rId35" cstate="none"/>
                     <a:srcRect/>
                     <a:stretch>
                       <a:fillRect/>
@@ -2254,7 +2329,7 @@
                     </pic:cNvPicPr>
                   </pic:nvPicPr>
                   <pic:blipFill>
-                    <a:blip r:embed="rId35" cstate="none"/>
+                    <a:blip r:embed="rId36" cstate="none"/>
                     <a:srcRect/>
                     <a:stretch>
                       <a:fillRect/>
@@ -2329,7 +2404,7 @@
                     </pic:cNvPicPr>
                   </pic:nvPicPr>
                   <pic:blipFill>
-                    <a:blip r:embed="rId36" cstate="none"/>
+                    <a:blip r:embed="rId37" cstate="none"/>
                     <a:srcRect/>
                     <a:stretch>
                       <a:fillRect/>
@@ -2404,7 +2479,7 @@
                     </pic:cNvPicPr>
                   </pic:nvPicPr>
                   <pic:blipFill>
-                    <a:blip r:embed="rId37" cstate="none"/>
+                    <a:blip r:embed="rId38" cstate="none"/>
                     <a:srcRect/>
                     <a:stretch>
                       <a:fillRect/>
@@ -2479,7 +2554,7 @@
                     </pic:cNvPicPr>
                   </pic:nvPicPr>
                   <pic:blipFill>
-                    <a:blip r:embed="rId38" cstate="none"/>
+                    <a:blip r:embed="rId39" cstate="none"/>
                     <a:srcRect/>
                     <a:stretch>
                       <a:fillRect/>
@@ -2554,7 +2629,7 @@
                     </pic:cNvPicPr>
                   </pic:nvPicPr>
                   <pic:blipFill>
-                    <a:blip r:embed="rId39" cstate="none"/>
+                    <a:blip r:embed="rId40" cstate="none"/>
                     <a:srcRect/>
                     <a:stretch>
                       <a:fillRect/>

</xml_diff>